<commit_message>
docs: corrigindo erro no modelo de ata
</commit_message>
<xml_diff>
--- a/Defesa-Mestrado-Camunda/defesa-mestrado/src/main/java/br/edu/ifes/mestrado/documentos/templates/entrada/MODELO_ATA.docx
+++ b/Defesa-Mestrado-Camunda/defesa-mestrado/src/main/java/br/edu/ifes/mestrado/documentos/templates/entrada/MODELO_ATA.docx
@@ -370,7 +370,23 @@
           <w:sz w:val="24"/>
           <w:szCs w:val="24"/>
         </w:rPr>
-        <w:t xml:space="preserve"> horas, foi realizada na Sala </w:t>
+        <w:t xml:space="preserve"> horas, foi realizada </w:t>
+      </w:r>
+      <w:r>
+        <w:rPr>
+          <w:color w:val="000000"/>
+          <w:sz w:val="24"/>
+          <w:szCs w:val="24"/>
+        </w:rPr>
+        <w:t>no(a)</w:t>
+      </w:r>
+      <w:r>
+        <w:rPr>
+          <w:color w:val="000000"/>
+          <w:sz w:val="24"/>
+          <w:szCs w:val="24"/>
+        </w:rPr>
+        <w:t xml:space="preserve"> </w:t>
       </w:r>
       <w:r>
         <w:rPr>
@@ -1569,7 +1585,6 @@
   <w:style w:type="character" w:default="1" w:styleId="DefaultParagraphFont">
     <w:name w:val="Default Paragraph Font"/>
     <w:uiPriority w:val="1"/>
-    <w:semiHidden/>
     <w:unhideWhenUsed/>
   </w:style>
   <w:style w:type="table" w:default="1" w:styleId="TableNormal">

</xml_diff>